<commit_message>
Add unit test for AvaWatcher link verification
- Introduced a new test file `test_watcher_tracing.py` to validate the functionality of the `AvaWatcher` class.
- Implemented dummy classes to simulate browser behavior and context management for testing purposes.
- Created a test case `test_verify_link_traces_tool_observation` to ensure that the link verification process correctly interacts with the observation system and returns expected results.
</commit_message>
<xml_diff>
--- a/drafts/B_CoverLetter.docx
+++ b/drafts/B_CoverLetter.docx
@@ -59,7 +59,7 @@
         <w:br/>
         <w:t>B</w:t>
         <w:br/>
-        <w:t>444 Madison Ave New York, NY 10022-6903</w:t>
+        <w:t>B Lab Suite 207, 200 Broadway, 3rd Floor, New York, NY 10038</w:t>
       </w:r>
     </w:p>
     <w:p>
@@ -75,67 +75,52 @@
       </w:r>
     </w:p>
     <w:p>
-      <w:r>
-        <w:t>Ava Aschettino</w:t>
-      </w:r>
-    </w:p>
-    <w:p>
-      <w:r>
-        <w:t>New York, NY</w:t>
-      </w:r>
-    </w:p>
-    <w:p>
-      <w:r>
-        <w:t>(516) 532-3384</w:t>
-      </w:r>
-    </w:p>
-    <w:p>
-      <w:r>
-        <w:t xml:space="preserve">avaaschettino@gmail.com </w:t>
-      </w:r>
-    </w:p>
-    <w:p>
-      <w:r>
-        <w:t>Hiring Manager</w:t>
-      </w:r>
-    </w:p>
-    <w:p>
-      <w:r>
-        <w:t>B</w:t>
-      </w:r>
-    </w:p>
-    <w:p>
+      <w:pPr>
+        <w:spacing w:after="240"/>
+      </w:pPr>
       <w:r>
         <w:t>I am writing to express my strong interest in the B position at B. With hands-on experience in marketing coordination, partnerships, and communications, I am excited by the opportunity to contribute to B.</w:t>
       </w:r>
     </w:p>
     <w:p>
+      <w:pPr>
+        <w:spacing w:after="240"/>
+      </w:pPr>
       <w:r>
         <w:t>In my current role as Marketing &amp; Partnerships Assistant at The Paley Center for Media, I support the execution of integrated marketing campaigns and large-scale events, collaborating across internal teams and external partners to ensure seamless delivery. I coordinate marketing assets, manage timelines, and track deliverables across multiple campaigns while supporting partner activations and outreach efforts to expand reach and drive engagement. This experience has strengthened my ability to stay highly organized, communicate effectively, and execute projects in fast-paced, deadline-driven environments.</w:t>
       </w:r>
     </w:p>
     <w:p>
+      <w:pPr>
+        <w:spacing w:after="240"/>
+      </w:pPr>
       <w:r>
         <w:t>I have also developed a strong foundation in B, where I have supported B from planning through execution. I have experience in B, which has strengthened my ability to manage multiple priorities while maintaining attention to detail and accuracy.</w:t>
       </w:r>
     </w:p>
     <w:p>
-      <w:r>
-        <w:t>I am particularly drawn to B because of its commitment to excellence and innovation. I am eager to bring a proactive, collaborative approach and strong organizational skills to support B.</w:t>
-      </w:r>
-    </w:p>
-    <w:p>
+      <w:pPr>
+        <w:spacing w:after="240"/>
+      </w:pPr>
+      <w:r>
+        <w:t>I am particularly drawn to B because of B. I am eager to bring a proactive, collaborative approach and strong organizational skills to support B.</w:t>
+      </w:r>
+    </w:p>
+    <w:p>
+      <w:pPr>
+        <w:spacing w:after="240"/>
+      </w:pPr>
       <w:r>
         <w:t>Thank you for your time and consideration. I would welcome the opportunity to further discuss how my experience and interests align with this role.</w:t>
       </w:r>
     </w:p>
     <w:p>
+      <w:pPr>
+        <w:spacing w:after="240"/>
+      </w:pPr>
       <w:r>
         <w:t>Sincerely,</w:t>
-      </w:r>
-    </w:p>
-    <w:p>
-      <w:r>
+        <w:br/>
         <w:t>Ava Aschettino</w:t>
       </w:r>
     </w:p>

</xml_diff>